<commit_message>
Remove RetryAnalyzer and update documentation
</commit_message>
<xml_diff>
--- a/Test_Automation_Instructions.docx
+++ b/Test_Automation_Instructions.docx
@@ -4065,27 +4065,6 @@
         </w:rPr>
       </w:r>
     </w:p>
-    <w:p>
-      <w:pPr>
-        <w:rPr>
-          <w:rFonts w:ascii="Times New Roman" w:cs="Times New Roman" w:eastAsia="Times New Roman" w:hAnsi="Times New Roman"/>
-        </w:rPr>
-      </w:pPr>
-      <w:r>
-        <w:rPr>
-          <w:rFonts w:ascii="Times New Roman" w:cs="Times New Roman" w:eastAsia="Times New Roman" w:hAnsi="Times New Roman"/>
-          <w:i w:val="0"/>
-          <w:iCs w:val="0"/>
-          <w:rtl w:val="0"/>
-        </w:rPr>
-        <w:t>RetryAnalyzer (Inactive): The RetryAnalyzer class is included as part of the framework infrastructure but is not applied to any test by default. It can be enabled per-test via @Test(retryAnalyzer = RetryAnalyzer.class) when flaky test handling is needed.</w:t>
-      </w:r>
-      <w:r>
-        <w:rPr>
-          <w:rtl w:val="0"/>
-        </w:rPr>
-      </w:r>
-    </w:p>
     <w:tbl>
       <w:tblPr>
         <w:tblStyle w:val="Table6"/>
@@ -4726,84 +4705,6 @@
           </w:p>
         </w:tc>
       </w:tr>
-      <w:tr>
-        <w:trPr>
-          <w:cantSplit w:val="0"/>
-          <w:tblHeader w:val="0"/>
-        </w:trPr>
-        <w:tc>
-          <w:tcPr/>
-          <w:p>
-            <w:pPr>
-              <w:rPr>
-                <w:rFonts w:ascii="Times New Roman" w:cs="Times New Roman" w:eastAsia="Times New Roman" w:hAnsi="Times New Roman"/>
-              </w:rPr>
-            </w:pPr>
-            <w:r>
-              <w:rPr>
-                <w:rFonts w:ascii="Times New Roman" w:cs="Times New Roman" w:eastAsia="Times New Roman" w:hAnsi="Times New Roman"/>
-                <w:sz w:val="20"/>
-                <w:szCs w:val="20"/>
-                <w:rtl w:val="0"/>
-              </w:rPr>
-              <w:t>Retry</w:t>
-            </w:r>
-            <w:r>
-              <w:rPr>
-                <w:rtl w:val="0"/>
-              </w:rPr>
-            </w:r>
-          </w:p>
-        </w:tc>
-        <w:tc>
-          <w:tcPr/>
-          <w:p>
-            <w:pPr>
-              <w:rPr>
-                <w:rFonts w:ascii="Times New Roman" w:cs="Times New Roman" w:eastAsia="Times New Roman" w:hAnsi="Times New Roman"/>
-              </w:rPr>
-            </w:pPr>
-            <w:r>
-              <w:rPr>
-                <w:rFonts w:ascii="Times New Roman" w:cs="Times New Roman" w:eastAsia="Times New Roman" w:hAnsi="Times New Roman"/>
-                <w:sz w:val="20"/>
-                <w:szCs w:val="20"/>
-                <w:rtl w:val="0"/>
-              </w:rPr>
-              <w:t>RetryAnalyzer.java</w:t>
-            </w:r>
-            <w:r>
-              <w:rPr>
-                <w:rtl w:val="0"/>
-              </w:rPr>
-            </w:r>
-          </w:p>
-        </w:tc>
-        <w:tc>
-          <w:tcPr/>
-          <w:p>
-            <w:pPr>
-              <w:rPr>
-                <w:rFonts w:ascii="Times New Roman" w:cs="Times New Roman" w:eastAsia="Times New Roman" w:hAnsi="Times New Roman"/>
-              </w:rPr>
-            </w:pPr>
-            <w:r>
-              <w:rPr>
-                <w:rFonts w:ascii="Times New Roman" w:cs="Times New Roman" w:eastAsia="Times New Roman" w:hAnsi="Times New Roman"/>
-                <w:sz w:val="20"/>
-                <w:szCs w:val="20"/>
-                <w:rtl w:val="0"/>
-              </w:rPr>
-              <w:t>IRetryAnalyzer. Automatic retry up to 2x. Available but NOT applied to any test by default</w:t>
-            </w:r>
-            <w:r>
-              <w:rPr>
-                <w:rtl w:val="0"/>
-              </w:rPr>
-            </w:r>
-          </w:p>
-        </w:tc>
-      </w:tr>
     </w:tbl>
     <w:p>
       <w:pPr>
@@ -5496,97 +5397,6 @@
           <w:rtl w:val="0"/>
         </w:rPr>
         <w:t>10. Project Structure</w:t>
-      </w:r>
-    </w:p>
-    <w:p>
-      <w:pPr>
-        <w:rPr>
-          <w:rFonts w:ascii="Times New Roman" w:cs="Times New Roman" w:eastAsia="Times New Roman" w:hAnsi="Times New Roman"/>
-        </w:rPr>
-      </w:pPr>
-      <w:r>
-        <w:rPr>
-          <w:rFonts w:ascii="Times New Roman" w:cs="Times New Roman" w:eastAsia="Times New Roman" w:hAnsi="Times New Roman"/>
-          <w:sz w:val="18"/>
-          <w:szCs w:val="18"/>
-          <w:rtl w:val="0"/>
-        </w:rPr>
-        <w:t>├── .github/workflows/</w:t>
-        <w:br/>
-        <w:t>│   └── test.yml                          CI pipeline (GitHub Actions)</w:t>
-        <w:br/>
-        <w:t>├── pom.xml                               Dependencies &amp; build config</w:t>
-        <w:br/>
-        <w:t>├── README.md                             Quick start &amp; usage guide</w:t>
-        <w:br/>
-        <w:t>├── test-reports/</w:t>
-        <w:br/>
-        <w:t>│   ├── ExtentReport.html                 HTML report (pre-generated)</w:t>
-        <w:br/>
-        <w:t>│   └── testng-results.xml                XML report (pre-generated)</w:t>
-        <w:br/>
-        <w:t>│</w:t>
-        <w:br/>
-        <w:t>├── src/main/java/com/rbauction/</w:t>
-        <w:br/>
-        <w:t>│   ├── base/</w:t>
-        <w:br/>
-        <w:t>│   │   └── BaseTest.java                 WebDriver lifecycle, openHomePage()</w:t>
-        <w:br/>
-        <w:t>│   ├── config/</w:t>
-        <w:br/>
-        <w:t>│   │   └── ConfigReader.java             Singleton config + env alias resolution</w:t>
-        <w:br/>
-        <w:t>│   ├── listeners/</w:t>
-        <w:br/>
-        <w:t>│   │   ├── RetryAnalyzer.java            Flaky test retry (available, not applied)</w:t>
-        <w:br/>
-        <w:t>│   │   └── TestListener.java             ExtentReports + step logging + screenshots</w:t>
-        <w:br/>
-        <w:t>│   ├── pages/</w:t>
-        <w:br/>
-        <w:t>│   │   ├── BasePage.java                 Shared driver, waits, dialog handling</w:t>
-        <w:br/>
-        <w:t>│   │   ├── HomePage.java                 open() + searchFor()</w:t>
-        <w:br/>
-        <w:t>│   │   └── SearchResultsPage.java        Result count, first result, year filter</w:t>
-        <w:br/>
-        <w:t>│   └── utils/</w:t>
-        <w:br/>
-        <w:t>│       ├── DriverFactory.java            Chrome driver creation + headless</w:t>
-        <w:br/>
-        <w:t>│       └── ScreenshotUtils.java          Base64 screenshot capture</w:t>
-        <w:br/>
-        <w:t>│</w:t>
-        <w:br/>
-        <w:t>└── src/test/</w:t>
-        <w:br/>
-        <w:t xml:space="preserve">    ├── java/com/rbauction/</w:t>
-        <w:br/>
-        <w:t xml:space="preserve">    │   ├── data/</w:t>
-        <w:br/>
-        <w:t xml:space="preserve">    │   │   └── TestData.java             @DataProvider, reads JSON test data</w:t>
-        <w:br/>
-        <w:t xml:space="preserve">    │   └── tests/smoke/</w:t>
-        <w:br/>
-        <w:t xml:space="preserve">    │       └── SearchTests.java          2 test methods, 3 executions</w:t>
-        <w:br/>
-        <w:t xml:space="preserve">    └── resources/</w:t>
-        <w:br/>
-        <w:t xml:space="preserve">        ├── config.properties             Framework settings + env aliases</w:t>
-        <w:br/>
-        <w:t xml:space="preserve">        ├── logback-test.xml              SLF4J logging config</w:t>
-        <w:br/>
-        <w:t xml:space="preserve">        ├── testng.xml                    Suite config (parallel, listeners)</w:t>
-        <w:br/>
-        <w:t xml:space="preserve">        └── testdata/</w:t>
-        <w:br/>
-        <w:t xml:space="preserve">            └── test-data.json          All test data (search + year filter)</w:t>
-      </w:r>
-      <w:r>
-        <w:rPr>
-          <w:rtl w:val="0"/>
-        </w:rPr>
       </w:r>
     </w:p>
     <w:p>

</xml_diff>

<commit_message>
Remove STG/DEV environment aliases, keep PROD only
</commit_message>
<xml_diff>
--- a/Test_Automation_Instructions.docx
+++ b/Test_Automation_Instructions.docx
@@ -1116,96 +1116,6 @@
           </w:p>
         </w:tc>
       </w:tr>
-      <w:tr>
-        <w:trPr>
-          <w:cantSplit w:val="0"/>
-          <w:tblHeader w:val="0"/>
-        </w:trPr>
-        <w:tc>
-          <w:tcPr/>
-          <w:p>
-            <w:pPr>
-              <w:rPr>
-                <w:rFonts w:ascii="Times New Roman" w:cs="Times New Roman" w:eastAsia="Times New Roman" w:hAnsi="Times New Roman"/>
-              </w:rPr>
-            </w:pPr>
-            <w:r>
-              <w:rPr>
-                <w:rFonts w:ascii="Times New Roman" w:cs="Times New Roman" w:eastAsia="Times New Roman" w:hAnsi="Times New Roman"/>
-                <w:sz w:val="20"/>
-                <w:szCs w:val="20"/>
-                <w:rtl w:val="0"/>
-              </w:rPr>
-              <w:t>mvn clean test -Denv=STG</w:t>
-            </w:r>
-            <w:r>
-              <w:rPr>
-                <w:rtl w:val="0"/>
-              </w:rPr>
-            </w:r>
-          </w:p>
-        </w:tc>
-        <w:tc>
-          <w:tcPr/>
-          <w:p>
-            <w:pPr>
-              <w:rPr>
-                <w:rFonts w:ascii="Times New Roman" w:cs="Times New Roman" w:eastAsia="Times New Roman" w:hAnsi="Times New Roman"/>
-              </w:rPr>
-            </w:pPr>
-            <w:r>
-              <w:rPr>
-                <w:rtl w:val="0"/>
-              </w:rPr>
-            </w:r>
-          </w:p>
-        </w:tc>
-      </w:tr>
-      <w:tr>
-        <w:trPr>
-          <w:cantSplit w:val="0"/>
-          <w:tblHeader w:val="0"/>
-        </w:trPr>
-        <w:tc>
-          <w:tcPr/>
-          <w:p>
-            <w:pPr>
-              <w:rPr>
-                <w:rFonts w:ascii="Times New Roman" w:cs="Times New Roman" w:eastAsia="Times New Roman" w:hAnsi="Times New Roman"/>
-              </w:rPr>
-            </w:pPr>
-            <w:r>
-              <w:rPr>
-                <w:rFonts w:ascii="Times New Roman" w:cs="Times New Roman" w:eastAsia="Times New Roman" w:hAnsi="Times New Roman"/>
-                <w:sz w:val="20"/>
-                <w:szCs w:val="20"/>
-                <w:rtl w:val="0"/>
-              </w:rPr>
-              <w:t>mvn clean test -Denv=DEV</w:t>
-            </w:r>
-            <w:r>
-              <w:rPr>
-                <w:rtl w:val="0"/>
-              </w:rPr>
-            </w:r>
-          </w:p>
-        </w:tc>
-        <w:tc>
-          <w:tcPr/>
-          <w:p>
-            <w:pPr>
-              <w:rPr>
-                <w:rFonts w:ascii="Times New Roman" w:cs="Times New Roman" w:eastAsia="Times New Roman" w:hAnsi="Times New Roman"/>
-              </w:rPr>
-            </w:pPr>
-            <w:r>
-              <w:rPr>
-                <w:rtl w:val="0"/>
-              </w:rPr>
-            </w:r>
-          </w:p>
-        </w:tc>
-      </w:tr>
     </w:tbl>
     <w:p>
       <w:pPr>
@@ -1488,7 +1398,7 @@
           <w:szCs w:val="20"/>
           <w:rtl w:val="0"/>
         </w:rPr>
-        <w:t>mvn clean test -Denv=STG -Dheadless=true</w:t>
+        <w:t>mvn clean test -Denv=PROD -Dheadless=true</w:t>
       </w:r>
       <w:r>
         <w:rPr>
@@ -2135,144 +2045,6 @@
           </w:p>
         </w:tc>
       </w:tr>
-      <w:tr>
-        <w:trPr>
-          <w:cantSplit w:val="0"/>
-          <w:tblHeader w:val="0"/>
-        </w:trPr>
-        <w:tc>
-          <w:tcPr/>
-          <w:p>
-            <w:pPr>
-              <w:rPr>
-                <w:rFonts w:ascii="Times New Roman" w:cs="Times New Roman" w:eastAsia="Times New Roman" w:hAnsi="Times New Roman"/>
-              </w:rPr>
-            </w:pPr>
-            <w:r>
-              <w:rPr>
-                <w:rFonts w:ascii="Times New Roman" w:cs="Times New Roman" w:eastAsia="Times New Roman" w:hAnsi="Times New Roman"/>
-                <w:sz w:val="20"/>
-                <w:szCs w:val="20"/>
-                <w:rtl w:val="0"/>
-              </w:rPr>
-              <w:t>env.stg</w:t>
-            </w:r>
-            <w:r>
-              <w:rPr>
-                <w:rtl w:val="0"/>
-              </w:rPr>
-            </w:r>
-          </w:p>
-        </w:tc>
-        <w:tc>
-          <w:tcPr/>
-          <w:p>
-            <w:pPr>
-              <w:rPr>
-                <w:rFonts w:ascii="Times New Roman" w:cs="Times New Roman" w:eastAsia="Times New Roman" w:hAnsi="Times New Roman"/>
-              </w:rPr>
-            </w:pPr>
-            <w:r>
-              <w:rPr>
-                <w:rtl w:val="0"/>
-              </w:rPr>
-            </w:r>
-          </w:p>
-        </w:tc>
-        <w:tc>
-          <w:tcPr/>
-          <w:p>
-            <w:pPr>
-              <w:rPr>
-                <w:rFonts w:ascii="Times New Roman" w:cs="Times New Roman" w:eastAsia="Times New Roman" w:hAnsi="Times New Roman"/>
-              </w:rPr>
-            </w:pPr>
-            <w:r>
-              <w:rPr>
-                <w:rFonts w:ascii="Times New Roman" w:cs="Times New Roman" w:eastAsia="Times New Roman" w:hAnsi="Times New Roman"/>
-                <w:sz w:val="20"/>
-                <w:szCs w:val="20"/>
-                <w:rtl w:val="0"/>
-              </w:rPr>
-              <w:t>STG environment URL</w:t>
-            </w:r>
-            <w:r>
-              <w:rPr>
-                <w:rtl w:val="0"/>
-              </w:rPr>
-            </w:r>
-          </w:p>
-        </w:tc>
-      </w:tr>
-      <w:tr>
-        <w:trPr>
-          <w:cantSplit w:val="0"/>
-          <w:tblHeader w:val="0"/>
-        </w:trPr>
-        <w:tc>
-          <w:tcPr/>
-          <w:p>
-            <w:pPr>
-              <w:rPr>
-                <w:rFonts w:ascii="Times New Roman" w:cs="Times New Roman" w:eastAsia="Times New Roman" w:hAnsi="Times New Roman"/>
-              </w:rPr>
-            </w:pPr>
-            <w:r>
-              <w:rPr>
-                <w:rFonts w:ascii="Times New Roman" w:cs="Times New Roman" w:eastAsia="Times New Roman" w:hAnsi="Times New Roman"/>
-                <w:sz w:val="20"/>
-                <w:szCs w:val="20"/>
-                <w:rtl w:val="0"/>
-              </w:rPr>
-              <w:t>env.dev</w:t>
-            </w:r>
-            <w:r>
-              <w:rPr>
-                <w:rtl w:val="0"/>
-              </w:rPr>
-            </w:r>
-          </w:p>
-        </w:tc>
-        <w:tc>
-          <w:tcPr/>
-          <w:p>
-            <w:pPr>
-              <w:rPr>
-                <w:rFonts w:ascii="Times New Roman" w:cs="Times New Roman" w:eastAsia="Times New Roman" w:hAnsi="Times New Roman"/>
-              </w:rPr>
-            </w:pPr>
-            <w:r>
-              <w:rPr>
-                <w:rtl w:val="0"/>
-              </w:rPr>
-            </w:r>
-          </w:p>
-        </w:tc>
-        <w:tc>
-          <w:tcPr/>
-          <w:p>
-            <w:pPr>
-              <w:rPr>
-                <w:rFonts w:ascii="Times New Roman" w:cs="Times New Roman" w:eastAsia="Times New Roman" w:hAnsi="Times New Roman"/>
-              </w:rPr>
-            </w:pPr>
-            <w:r>
-              <w:rPr>
-                <w:rFonts w:ascii="Times New Roman" w:cs="Times New Roman" w:eastAsia="Times New Roman" w:hAnsi="Times New Roman"/>
-                <w:sz w:val="20"/>
-                <w:szCs w:val="20"/>
-                <w:rtl w:val="0"/>
-              </w:rPr>
-              <w:t>DEV environment URL</w:t>
-            </w:r>
-            <w:r>
-              <w:rPr>
-                <w:rtl w:val="0"/>
-              </w:rPr>
-            </w:r>
-          </w:p>
-        </w:tc>
-      </w:tr>
     </w:tbl>
     <w:p>
       <w:pPr>
@@ -4057,7 +3829,7 @@
           <w:iCs w:val="0"/>
           <w:rtl w:val="0"/>
         </w:rPr>
-        <w:t>Config-Driven Execution: All settings (URL, browser, timeouts, headless mode) are externalized to config.properties and can be overridden from the command line. Environment aliases allow switching between PROD, STG, and DEV with a single flag.</w:t>
+        <w:t>Config-Driven Execution: All settings (URL, browser, timeouts, headless mode) are externalized to config.properties and can be overridden from the command line. The -Denv=PROD flag resolves the URL from config.properties. Additional environments can be added by defining new env.&lt;name&gt; entries.</w:t>
       </w:r>
       <w:r>
         <w:rPr>

</xml_diff>